<commit_message>
update Bonsai Work Flow
</commit_message>
<xml_diff>
--- a/Camera setting for harp trigger.docx
+++ b/Camera setting for harp trigger.docx
@@ -3,33 +3,59 @@
 <w:document xmlns:wpc="http://schemas.microsoft.com/office/word/2010/wordprocessingCanvas" xmlns:cx="http://schemas.microsoft.com/office/drawing/2014/chartex" xmlns:cx1="http://schemas.microsoft.com/office/drawing/2015/9/8/chartex" xmlns:cx2="http://schemas.microsoft.com/office/drawing/2015/10/21/chartex" xmlns:cx3="http://schemas.microsoft.com/office/drawing/2016/5/9/chartex" xmlns:cx4="http://schemas.microsoft.com/office/drawing/2016/5/10/chartex" xmlns:cx5="http://schemas.microsoft.com/office/drawing/2016/5/11/chartex" xmlns:cx6="http://schemas.microsoft.com/office/drawing/2016/5/12/chartex" xmlns:cx7="http://schemas.microsoft.com/office/drawing/2016/5/13/chartex" xmlns:cx8="http://schemas.microsoft.com/office/drawing/2016/5/14/chartex" xmlns:mc="http://schemas.openxmlformats.org/markup-compatibility/2006" xmlns:aink="http://schemas.microsoft.com/office/drawing/2016/ink" xmlns:am3d="http://schemas.microsoft.com/office/drawing/2017/model3d" xmlns:o="urn:schemas-microsoft-com:office:office" xmlns:oel="http://schemas.microsoft.com/office/2019/extlst" xmlns:r="http://schemas.openxmlformats.org/officeDocument/2006/relationships" xmlns:m="http://schemas.openxmlformats.org/officeDocument/2006/math" xmlns:v="urn:schemas-microsoft-com:vml" xmlns:wp14="http://schemas.microsoft.com/office/word/2010/wordprocessingDrawing" xmlns:wp="http://schemas.openxmlformats.org/drawingml/2006/wordprocessingDrawing" xmlns:w10="urn:schemas-microsoft-com:office:word" xmlns:w="http://schemas.openxmlformats.org/wordprocessingml/2006/main" xmlns:w14="http://schemas.microsoft.com/office/word/2010/wordml" xmlns:w15="http://schemas.microsoft.com/office/word/2012/wordml" xmlns:w16cex="http://schemas.microsoft.com/office/word/2018/wordml/cex" xmlns:w16cid="http://schemas.microsoft.com/office/word/2016/wordml/cid" xmlns:w16="http://schemas.microsoft.com/office/word/2018/wordml" xmlns:w16du="http://schemas.microsoft.com/office/word/2023/wordml/word16du" xmlns:w16sdtdh="http://schemas.microsoft.com/office/word/2020/wordml/sdtdatahash" xmlns:w16sdtfl="http://schemas.microsoft.com/office/word/2024/wordml/sdtformatlock" xmlns:w16se="http://schemas.microsoft.com/office/word/2015/wordml/symex" xmlns:wpg="http://schemas.microsoft.com/office/word/2010/wordprocessingGroup" xmlns:wpi="http://schemas.microsoft.com/office/word/2010/wordprocessingInk" xmlns:wne="http://schemas.microsoft.com/office/word/2006/wordml" xmlns:wps="http://schemas.microsoft.com/office/word/2010/wordprocessingShape" mc:Ignorable="w14 w15 w16se w16cid w16 w16cex w16sdtdh w16sdtfl w16du wp14">
   <w:body>
     <w:p>
-      <w:r>
-        <w:t xml:space="preserve">Camera </w:t>
-      </w:r>
-      <w:r>
-        <w:t>17458434</w:t>
-      </w:r>
-    </w:p>
-    <w:p>
-      <w:r>
-        <w:t>Gain at 3</w:t>
-      </w:r>
-      <w:r>
-        <w:t>5</w:t>
-      </w:r>
-    </w:p>
-    <w:p/>
-    <w:p/>
+      <w:hyperlink r:id="rId4" w:history="1">
+        <w:r>
+          <w:rPr>
+            <w:rStyle w:val="Hyperlink"/>
+          </w:rPr>
+          <w:t>Camera Configuration | CDC.SoundLateralizationTask</w:t>
+        </w:r>
+      </w:hyperlink>
+    </w:p>
+    <w:p/>
+    <w:p>
+      <w:r>
+        <w:t>Camera 17458434</w:t>
+      </w:r>
+      <w:r>
+        <w:t xml:space="preserve"> </w:t>
+      </w:r>
+    </w:p>
+    <w:p>
+      <w:r>
+        <w:t>Gain at 35</w:t>
+      </w:r>
+    </w:p>
+    <w:p>
+      <w:r>
+        <w:t>Exposure 536 us</w:t>
+      </w:r>
+      <w:r>
+        <w:t xml:space="preserve"> (default)</w:t>
+      </w:r>
+    </w:p>
+    <w:p/>
+    <w:p>
+      <w:r>
+        <w:t xml:space="preserve">With Aeon </w:t>
+      </w:r>
+      <w:r>
+        <w:t>Spinnaker Capture</w:t>
+      </w:r>
+      <w:r>
+        <w:t xml:space="preserve"> </w:t>
+      </w:r>
+    </w:p>
     <w:p>
       <w:r>
         <w:rPr>
           <w:noProof/>
         </w:rPr>
         <w:drawing>
-          <wp:inline distT="0" distB="0" distL="0" distR="0" wp14:anchorId="7B3A9726" wp14:editId="0E497FD1">
-            <wp:extent cx="5731510" cy="4407535"/>
-            <wp:effectExtent l="0" t="0" r="2540" b="0"/>
-            <wp:docPr id="1257603005" name="Picture 1"/>
+          <wp:inline distT="0" distB="0" distL="0" distR="0" wp14:anchorId="6FDDDD36" wp14:editId="2D7C5342">
+            <wp:extent cx="1952898" cy="2343477"/>
+            <wp:effectExtent l="0" t="0" r="9525" b="0"/>
+            <wp:docPr id="327621951" name="Picture 1"/>
             <wp:cNvGraphicFramePr>
               <a:graphicFrameLocks xmlns:a="http://schemas.openxmlformats.org/drawingml/2006/main" noChangeAspect="1"/>
             </wp:cNvGraphicFramePr>
@@ -37,52 +63,7 @@
               <a:graphicData uri="http://schemas.openxmlformats.org/drawingml/2006/picture">
                 <pic:pic xmlns:pic="http://schemas.openxmlformats.org/drawingml/2006/picture">
                   <pic:nvPicPr>
-                    <pic:cNvPr id="1257603005" name=""/>
-                    <pic:cNvPicPr/>
-                  </pic:nvPicPr>
-                  <pic:blipFill>
-                    <a:blip r:embed="rId4"/>
-                    <a:stretch>
-                      <a:fillRect/>
-                    </a:stretch>
-                  </pic:blipFill>
-                  <pic:spPr>
-                    <a:xfrm>
-                      <a:off x="0" y="0"/>
-                      <a:ext cx="5731510" cy="4407535"/>
-                    </a:xfrm>
-                    <a:prstGeom prst="rect">
-                      <a:avLst/>
-                    </a:prstGeom>
-                  </pic:spPr>
-                </pic:pic>
-              </a:graphicData>
-            </a:graphic>
-          </wp:inline>
-        </w:drawing>
-      </w:r>
-    </w:p>
-    <w:p/>
-    <w:p/>
-    <w:p>
-      <w:r>
-        <w:rPr>
-          <w:noProof/>
-        </w:rPr>
-        <w:lastRenderedPageBreak/>
-        <w:drawing>
-          <wp:inline distT="0" distB="0" distL="0" distR="0" wp14:anchorId="56BD74D5" wp14:editId="49491208">
-            <wp:extent cx="5731510" cy="3890645"/>
-            <wp:effectExtent l="0" t="0" r="2540" b="0"/>
-            <wp:docPr id="549051724" name="Picture 1"/>
-            <wp:cNvGraphicFramePr>
-              <a:graphicFrameLocks xmlns:a="http://schemas.openxmlformats.org/drawingml/2006/main" noChangeAspect="1"/>
-            </wp:cNvGraphicFramePr>
-            <a:graphic xmlns:a="http://schemas.openxmlformats.org/drawingml/2006/main">
-              <a:graphicData uri="http://schemas.openxmlformats.org/drawingml/2006/picture">
-                <pic:pic xmlns:pic="http://schemas.openxmlformats.org/drawingml/2006/picture">
-                  <pic:nvPicPr>
-                    <pic:cNvPr id="549051724" name=""/>
+                    <pic:cNvPr id="327621951" name=""/>
                     <pic:cNvPicPr/>
                   </pic:nvPicPr>
                   <pic:blipFill>
@@ -94,7 +75,7 @@
                   <pic:spPr>
                     <a:xfrm>
                       <a:off x="0" y="0"/>
-                      <a:ext cx="5731510" cy="3890645"/>
+                      <a:ext cx="1952898" cy="2343477"/>
                     </a:xfrm>
                     <a:prstGeom prst="rect">
                       <a:avLst/>
@@ -106,29 +87,105 @@
           </wp:inline>
         </w:drawing>
       </w:r>
-    </w:p>
-    <w:p/>
-    <w:p/>
-    <w:p/>
-    <w:p>
-      <w:hyperlink r:id="rId6" w:history="1">
-        <w:r>
-          <w:rPr>
-            <w:rStyle w:val="Hyperlink"/>
-          </w:rPr>
-          <w:t>Camera Configuration | CDC.SoundLateralizationTask</w:t>
-        </w:r>
-      </w:hyperlink>
-    </w:p>
-    <w:p/>
-    <w:p/>
-    <w:p/>
-    <w:p/>
-    <w:p/>
-    <w:p/>
-    <w:p/>
-    <w:p/>
-    <w:p/>
+      <w:r>
+        <w:rPr>
+          <w:noProof/>
+        </w:rPr>
+        <w:drawing>
+          <wp:inline distT="0" distB="0" distL="0" distR="0" wp14:anchorId="3FA801E2" wp14:editId="57A43F69">
+            <wp:extent cx="2733063" cy="2340031"/>
+            <wp:effectExtent l="0" t="0" r="0" b="3175"/>
+            <wp:docPr id="1190485919" name="Picture 1"/>
+            <wp:cNvGraphicFramePr>
+              <a:graphicFrameLocks xmlns:a="http://schemas.openxmlformats.org/drawingml/2006/main" noChangeAspect="1"/>
+            </wp:cNvGraphicFramePr>
+            <a:graphic xmlns:a="http://schemas.openxmlformats.org/drawingml/2006/main">
+              <a:graphicData uri="http://schemas.openxmlformats.org/drawingml/2006/picture">
+                <pic:pic xmlns:pic="http://schemas.openxmlformats.org/drawingml/2006/picture">
+                  <pic:nvPicPr>
+                    <pic:cNvPr id="1190485919" name=""/>
+                    <pic:cNvPicPr/>
+                  </pic:nvPicPr>
+                  <pic:blipFill>
+                    <a:blip r:embed="rId6"/>
+                    <a:stretch>
+                      <a:fillRect/>
+                    </a:stretch>
+                  </pic:blipFill>
+                  <pic:spPr>
+                    <a:xfrm>
+                      <a:off x="0" y="0"/>
+                      <a:ext cx="2755987" cy="2359658"/>
+                    </a:xfrm>
+                    <a:prstGeom prst="rect">
+                      <a:avLst/>
+                    </a:prstGeom>
+                  </pic:spPr>
+                </pic:pic>
+              </a:graphicData>
+            </a:graphic>
+          </wp:inline>
+        </w:drawing>
+      </w:r>
+    </w:p>
+    <w:p/>
+    <w:p>
+      <w:r>
+        <w:rPr>
+          <w:noProof/>
+        </w:rPr>
+        <w:drawing>
+          <wp:inline distT="0" distB="0" distL="0" distR="0" wp14:anchorId="55ABEEC5" wp14:editId="6B5C2E64">
+            <wp:extent cx="2995684" cy="2696979"/>
+            <wp:effectExtent l="0" t="0" r="0" b="8255"/>
+            <wp:docPr id="653972770" name="Picture 1"/>
+            <wp:cNvGraphicFramePr>
+              <a:graphicFrameLocks xmlns:a="http://schemas.openxmlformats.org/drawingml/2006/main" noChangeAspect="1"/>
+            </wp:cNvGraphicFramePr>
+            <a:graphic xmlns:a="http://schemas.openxmlformats.org/drawingml/2006/main">
+              <a:graphicData uri="http://schemas.openxmlformats.org/drawingml/2006/picture">
+                <pic:pic xmlns:pic="http://schemas.openxmlformats.org/drawingml/2006/picture">
+                  <pic:nvPicPr>
+                    <pic:cNvPr id="653972770" name=""/>
+                    <pic:cNvPicPr/>
+                  </pic:nvPicPr>
+                  <pic:blipFill>
+                    <a:blip r:embed="rId7"/>
+                    <a:stretch>
+                      <a:fillRect/>
+                    </a:stretch>
+                  </pic:blipFill>
+                  <pic:spPr>
+                    <a:xfrm>
+                      <a:off x="0" y="0"/>
+                      <a:ext cx="3001348" cy="2702078"/>
+                    </a:xfrm>
+                    <a:prstGeom prst="rect">
+                      <a:avLst/>
+                    </a:prstGeom>
+                  </pic:spPr>
+                </pic:pic>
+              </a:graphicData>
+            </a:graphic>
+          </wp:inline>
+        </w:drawing>
+      </w:r>
+    </w:p>
+    <w:p>
+      <w:r>
+        <w:t xml:space="preserve">Make sure </w:t>
+      </w:r>
+      <w:r>
+        <w:rPr>
+          <w:b/>
+          <w:bCs/>
+        </w:rPr>
+        <w:t>Max Image Size</w:t>
+      </w:r>
+      <w:r>
+        <w:t xml:space="preserve"> is clicked such that It captures full view</w:t>
+      </w:r>
+    </w:p>
     <w:p/>
     <w:p/>
     <w:p>
@@ -136,10 +193,24 @@
         <w:lastRenderedPageBreak/>
         <w:t>Camera 24166055</w:t>
       </w:r>
+      <w:r>
+        <w:t xml:space="preserve"> (Track 1)</w:t>
+      </w:r>
     </w:p>
     <w:p>
       <w:r>
         <w:t>Gain at 30</w:t>
+      </w:r>
+    </w:p>
+    <w:p>
+      <w:r>
+        <w:t xml:space="preserve">Exposure time </w:t>
+      </w:r>
+      <w:r>
+        <w:t>14998</w:t>
+      </w:r>
+      <w:r>
+        <w:t xml:space="preserve"> (default)</w:t>
       </w:r>
     </w:p>
     <w:p>
@@ -163,7 +234,7 @@
                     <pic:cNvPicPr/>
                   </pic:nvPicPr>
                   <pic:blipFill>
-                    <a:blip r:embed="rId7"/>
+                    <a:blip r:embed="rId8"/>
                     <a:stretch>
                       <a:fillRect/>
                     </a:stretch>
@@ -184,6 +255,259 @@
         </w:drawing>
       </w:r>
     </w:p>
+    <w:p/>
+    <w:p>
+      <w:r>
+        <w:rPr>
+          <w:noProof/>
+        </w:rPr>
+        <w:drawing>
+          <wp:inline distT="0" distB="0" distL="0" distR="0" wp14:anchorId="175D90DB" wp14:editId="7B9CE3E7">
+            <wp:extent cx="5731510" cy="2914015"/>
+            <wp:effectExtent l="0" t="0" r="2540" b="635"/>
+            <wp:docPr id="626251202" name="Picture 1"/>
+            <wp:cNvGraphicFramePr>
+              <a:graphicFrameLocks xmlns:a="http://schemas.openxmlformats.org/drawingml/2006/main" noChangeAspect="1"/>
+            </wp:cNvGraphicFramePr>
+            <a:graphic xmlns:a="http://schemas.openxmlformats.org/drawingml/2006/main">
+              <a:graphicData uri="http://schemas.openxmlformats.org/drawingml/2006/picture">
+                <pic:pic xmlns:pic="http://schemas.openxmlformats.org/drawingml/2006/picture">
+                  <pic:nvPicPr>
+                    <pic:cNvPr id="626251202" name=""/>
+                    <pic:cNvPicPr/>
+                  </pic:nvPicPr>
+                  <pic:blipFill>
+                    <a:blip r:embed="rId9"/>
+                    <a:stretch>
+                      <a:fillRect/>
+                    </a:stretch>
+                  </pic:blipFill>
+                  <pic:spPr>
+                    <a:xfrm>
+                      <a:off x="0" y="0"/>
+                      <a:ext cx="5731510" cy="2914015"/>
+                    </a:xfrm>
+                    <a:prstGeom prst="rect">
+                      <a:avLst/>
+                    </a:prstGeom>
+                  </pic:spPr>
+                </pic:pic>
+              </a:graphicData>
+            </a:graphic>
+          </wp:inline>
+        </w:drawing>
+      </w:r>
+    </w:p>
+    <w:p>
+      <w:pPr>
+        <w:rPr>
+          <w:b/>
+          <w:bCs/>
+        </w:rPr>
+      </w:pPr>
+      <w:r>
+        <w:rPr>
+          <w:b/>
+          <w:bCs/>
+        </w:rPr>
+        <w:t>Now with Aeon package Spinnaker Capture</w:t>
+      </w:r>
+    </w:p>
+    <w:p/>
+    <w:p/>
+    <w:p/>
+    <w:p/>
+    <w:p/>
+    <w:p/>
+    <w:p/>
+    <w:p/>
+    <w:p/>
+    <w:p/>
+    <w:p/>
+    <w:p/>
+    <w:p/>
+    <w:p/>
+    <w:p/>
+    <w:p/>
+    <w:p/>
+    <w:p/>
+    <w:p/>
+    <w:p/>
+    <w:p/>
+    <w:p/>
+    <w:p/>
+    <w:p/>
+    <w:p/>
+    <w:p/>
+    <w:p/>
+    <w:p/>
+    <w:p/>
+    <w:p/>
+    <w:p>
+      <w:r>
+        <w:t>Camera 18474551</w:t>
+      </w:r>
+    </w:p>
+    <w:p>
+      <w:r>
+        <w:t xml:space="preserve">Gain at </w:t>
+      </w:r>
+      <w:r>
+        <w:t>18</w:t>
+      </w:r>
+    </w:p>
+    <w:p>
+      <w:r>
+        <w:t>Exposure Time 997 us</w:t>
+      </w:r>
+    </w:p>
+    <w:p>
+      <w:r>
+        <w:t>(But quality can be better with higher exposure time for brighter view)</w:t>
+      </w:r>
+    </w:p>
+    <w:p>
+      <w:r>
+        <w:t>(Not sure why, for this camera, using Aeon Camera capture causes delay to come back!)</w:t>
+      </w:r>
+    </w:p>
+    <w:p>
+      <w:r>
+        <w:rPr>
+          <w:noProof/>
+        </w:rPr>
+        <w:drawing>
+          <wp:inline distT="0" distB="0" distL="0" distR="0" wp14:anchorId="67D0C400" wp14:editId="59A37B6D">
+            <wp:extent cx="5731510" cy="4681855"/>
+            <wp:effectExtent l="0" t="0" r="2540" b="4445"/>
+            <wp:docPr id="1376719534" name="Picture 1"/>
+            <wp:cNvGraphicFramePr>
+              <a:graphicFrameLocks xmlns:a="http://schemas.openxmlformats.org/drawingml/2006/main" noChangeAspect="1"/>
+            </wp:cNvGraphicFramePr>
+            <a:graphic xmlns:a="http://schemas.openxmlformats.org/drawingml/2006/main">
+              <a:graphicData uri="http://schemas.openxmlformats.org/drawingml/2006/picture">
+                <pic:pic xmlns:pic="http://schemas.openxmlformats.org/drawingml/2006/picture">
+                  <pic:nvPicPr>
+                    <pic:cNvPr id="1376719534" name=""/>
+                    <pic:cNvPicPr/>
+                  </pic:nvPicPr>
+                  <pic:blipFill>
+                    <a:blip r:embed="rId10"/>
+                    <a:stretch>
+                      <a:fillRect/>
+                    </a:stretch>
+                  </pic:blipFill>
+                  <pic:spPr>
+                    <a:xfrm>
+                      <a:off x="0" y="0"/>
+                      <a:ext cx="5731510" cy="4681855"/>
+                    </a:xfrm>
+                    <a:prstGeom prst="rect">
+                      <a:avLst/>
+                    </a:prstGeom>
+                  </pic:spPr>
+                </pic:pic>
+              </a:graphicData>
+            </a:graphic>
+          </wp:inline>
+        </w:drawing>
+      </w:r>
+    </w:p>
+    <w:p/>
+    <w:p/>
+    <w:p/>
+    <w:p/>
+    <w:p/>
+    <w:p/>
+    <w:p>
+      <w:r>
+        <w:lastRenderedPageBreak/>
+        <w:t>07/09/2026</w:t>
+      </w:r>
+    </w:p>
+    <w:p>
+      <w:r>
+        <w:drawing>
+          <wp:inline distT="0" distB="0" distL="0" distR="0" wp14:anchorId="09E08AE4" wp14:editId="4637C955">
+            <wp:extent cx="5731510" cy="6689090"/>
+            <wp:effectExtent l="0" t="0" r="2540" b="0"/>
+            <wp:docPr id="1577837401" name="Picture 1"/>
+            <wp:cNvGraphicFramePr>
+              <a:graphicFrameLocks xmlns:a="http://schemas.openxmlformats.org/drawingml/2006/main" noChangeAspect="1"/>
+            </wp:cNvGraphicFramePr>
+            <a:graphic xmlns:a="http://schemas.openxmlformats.org/drawingml/2006/main">
+              <a:graphicData uri="http://schemas.openxmlformats.org/drawingml/2006/picture">
+                <pic:pic xmlns:pic="http://schemas.openxmlformats.org/drawingml/2006/picture">
+                  <pic:nvPicPr>
+                    <pic:cNvPr id="1577837401" name=""/>
+                    <pic:cNvPicPr/>
+                  </pic:nvPicPr>
+                  <pic:blipFill>
+                    <a:blip r:embed="rId11"/>
+                    <a:stretch>
+                      <a:fillRect/>
+                    </a:stretch>
+                  </pic:blipFill>
+                  <pic:spPr>
+                    <a:xfrm>
+                      <a:off x="0" y="0"/>
+                      <a:ext cx="5731510" cy="6689090"/>
+                    </a:xfrm>
+                    <a:prstGeom prst="rect">
+                      <a:avLst/>
+                    </a:prstGeom>
+                  </pic:spPr>
+                </pic:pic>
+              </a:graphicData>
+            </a:graphic>
+          </wp:inline>
+        </w:drawing>
+      </w:r>
+    </w:p>
+    <w:p>
+      <w:r>
+        <w:rPr>
+          <w:noProof/>
+        </w:rPr>
+        <w:lastRenderedPageBreak/>
+        <w:drawing>
+          <wp:inline distT="0" distB="0" distL="0" distR="0" wp14:anchorId="5A966821" wp14:editId="28AF7465">
+            <wp:extent cx="5731510" cy="4453890"/>
+            <wp:effectExtent l="0" t="0" r="2540" b="3810"/>
+            <wp:docPr id="2129568250" name="Picture 1"/>
+            <wp:cNvGraphicFramePr>
+              <a:graphicFrameLocks xmlns:a="http://schemas.openxmlformats.org/drawingml/2006/main" noChangeAspect="1"/>
+            </wp:cNvGraphicFramePr>
+            <a:graphic xmlns:a="http://schemas.openxmlformats.org/drawingml/2006/main">
+              <a:graphicData uri="http://schemas.openxmlformats.org/drawingml/2006/picture">
+                <pic:pic xmlns:pic="http://schemas.openxmlformats.org/drawingml/2006/picture">
+                  <pic:nvPicPr>
+                    <pic:cNvPr id="2129568250" name=""/>
+                    <pic:cNvPicPr/>
+                  </pic:nvPicPr>
+                  <pic:blipFill>
+                    <a:blip r:embed="rId12"/>
+                    <a:stretch>
+                      <a:fillRect/>
+                    </a:stretch>
+                  </pic:blipFill>
+                  <pic:spPr>
+                    <a:xfrm>
+                      <a:off x="0" y="0"/>
+                      <a:ext cx="5731510" cy="4453890"/>
+                    </a:xfrm>
+                    <a:prstGeom prst="rect">
+                      <a:avLst/>
+                    </a:prstGeom>
+                  </pic:spPr>
+                </pic:pic>
+              </a:graphicData>
+            </a:graphic>
+          </wp:inline>
+        </w:drawing>
+      </w:r>
+    </w:p>
+    <w:p/>
     <w:sectPr>
       <w:pgSz w:w="11906" w:h="16838"/>
       <w:pgMar w:top="1440" w:right="1440" w:bottom="1440" w:left="1440" w:header="708" w:footer="708" w:gutter="0"/>

</xml_diff>